<commit_message>
Renumber specializations SP01–SP12 in the new order: 0.2 and 0.5 student files, sources notes
Co-Authored-By: Claude Opus 5.5 <noreply@anthropic.com>
Claude-Session: https://claude.ai/code/session_01NkN8BgtjYfiwSwyts9frHQ
</commit_message>
<xml_diff>
--- a/week1/0.5_Project_Scope_Sheet.docx
+++ b/week1/0.5_Project_Scope_Sheet.docx
@@ -10405,7 +10405,7 @@
                 <w:color w:val="1F1E1D"/>
                 <w:sz w:val="23"/>
               </w:rPr>
-              <w:t>Longitudinal Strength Calculation</w:t>
+              <w:t>Advanced Dimensional Analysis</w:t>
             </w:r>
           </w:p>
         </w:tc>
@@ -10429,7 +10429,7 @@
               <w:autoSpaceDE w:val="0"/>
               <w:widowControl/>
               <w:spacing w:line="262" w:lineRule="auto" w:before="106" w:after="0"/>
-              <w:ind w:left="144" w:right="288" w:firstLine="0"/>
+              <w:ind w:left="144" w:right="144" w:firstLine="0"/>
               <w:jc w:val="left"/>
             </w:pPr>
             <w:r>
@@ -10441,18 +10441,18 @@
                 <w:color w:val="1F1E1D"/>
                 <w:sz w:val="23"/>
               </w:rPr>
-              <w:t xml:space="preserve">Loads and bending moments · section </w:t>
-            </w:r>
-            <w:r>
-              <w:rPr>
-                <w:w w:val="98.08695419974948"/>
-                <w:rFonts w:ascii="Anthropic Sans Print" w:hAnsi="Anthropic Sans Print" w:eastAsia="Anthropic Sans Print"/>
-                <w:b w:val="0"/>
-                <w:i w:val="0"/>
-                <w:color w:val="1F1E1D"/>
-                <w:sz w:val="23"/>
-              </w:rPr>
-              <w:t>modulus check · midship section drawing</w:t>
+              <w:t xml:space="preserve">Regression equations for dimensions and </w:t>
+            </w:r>
+            <w:r>
+              <w:rPr>
+                <w:w w:val="98.08695419974948"/>
+                <w:rFonts w:ascii="Anthropic Sans Print" w:hAnsi="Anthropic Sans Print" w:eastAsia="Anthropic Sans Print"/>
+                <w:b w:val="0"/>
+                <w:i w:val="0"/>
+                <w:color w:val="1F1E1D"/>
+                <w:sz w:val="23"/>
+              </w:rPr>
+              <w:t>ratios · fit quality and validity range</w:t>
             </w:r>
           </w:p>
         </w:tc>
@@ -10527,7 +10527,7 @@
                 <w:color w:val="1F1E1D"/>
                 <w:sz w:val="23"/>
               </w:rPr>
-              <w:t>Hull–Propeller–Engine Matching</w:t>
+              <w:t>Parametric Hull Shape Generation</w:t>
             </w:r>
           </w:p>
         </w:tc>
@@ -10563,21 +10563,18 @@
                 <w:color w:val="1F1E1D"/>
                 <w:sz w:val="23"/>
               </w:rPr>
-              <w:t xml:space="preserve">Optimum B-series propeller · Engine </w:t>
-            </w:r>
-            <w:r>
-              <w:br/>
-            </w:r>
-            <w:r>
-              <w:rPr>
-                <w:w w:val="98.08695419974948"/>
-                <w:rFonts w:ascii="Anthropic Sans Print" w:hAnsi="Anthropic Sans Print" w:eastAsia="Anthropic Sans Print"/>
-                <w:b w:val="0"/>
-                <w:i w:val="0"/>
-                <w:color w:val="1F1E1D"/>
-                <w:sz w:val="23"/>
-              </w:rPr>
-              <w:t>matching · PTO/PTI modes · Stern drawing</w:t>
+              <w:t xml:space="preserve">Parametric hull definition · coupling to the </w:t>
+            </w:r>
+            <w:r>
+              <w:rPr>
+                <w:w w:val="98.08695419974948"/>
+                <w:rFonts w:ascii="Anthropic Sans Print" w:hAnsi="Anthropic Sans Print" w:eastAsia="Anthropic Sans Print"/>
+                <w:b w:val="0"/>
+                <w:i w:val="0"/>
+                <w:color w:val="1F1E1D"/>
+                <w:sz w:val="23"/>
+              </w:rPr>
+              <w:t>optimizer · lines plan</w:t>
             </w:r>
           </w:p>
         </w:tc>
@@ -10652,7 +10649,7 @@
                 <w:color w:val="1F1E1D"/>
                 <w:sz w:val="23"/>
               </w:rPr>
-              <w:t>Electrical Load Balance</w:t>
+              <w:t>Hull Shape Optimization</w:t>
             </w:r>
           </w:p>
         </w:tc>
@@ -10676,7 +10673,7 @@
               <w:autoSpaceDE w:val="0"/>
               <w:widowControl/>
               <w:spacing w:line="262" w:lineRule="auto" w:before="106" w:after="0"/>
-              <w:ind w:left="144" w:right="1008" w:firstLine="0"/>
+              <w:ind w:left="144" w:right="432" w:firstLine="0"/>
               <w:jc w:val="left"/>
             </w:pPr>
             <w:r>
@@ -10688,18 +10685,18 @@
                 <w:color w:val="1F1E1D"/>
                 <w:sz w:val="23"/>
               </w:rPr>
-              <w:t>Consumers per operating mode ·</w:t>
-            </w:r>
-            <w:r>
-              <w:rPr>
-                <w:w w:val="98.08695419974948"/>
-                <w:rFonts w:ascii="Anthropic Sans Print" w:hAnsi="Anthropic Sans Print" w:eastAsia="Anthropic Sans Print"/>
-                <w:b w:val="0"/>
-                <w:i w:val="0"/>
-                <w:color w:val="1F1E1D"/>
-                <w:sz w:val="23"/>
-              </w:rPr>
-              <w:t>generator sizing · one-line diagram</w:t>
+              <w:t xml:space="preserve">Hull variables and objective · resistance </w:t>
+            </w:r>
+            <w:r>
+              <w:rPr>
+                <w:w w:val="98.08695419974948"/>
+                <w:rFonts w:ascii="Anthropic Sans Print" w:hAnsi="Anthropic Sans Print" w:eastAsia="Anthropic Sans Print"/>
+                <w:b w:val="0"/>
+                <w:i w:val="0"/>
+                <w:color w:val="1F1E1D"/>
+                <w:sz w:val="23"/>
+              </w:rPr>
+              <w:t>gain · initial and optimized lines</w:t>
             </w:r>
           </w:p>
         </w:tc>
@@ -10774,7 +10771,7 @@
                 <w:color w:val="1F1E1D"/>
                 <w:sz w:val="23"/>
               </w:rPr>
-              <w:t>Detailed Cost Estimation</w:t>
+              <w:t>Hull–Propeller–Engine Matching</w:t>
             </w:r>
           </w:p>
         </w:tc>
@@ -10798,7 +10795,7 @@
               <w:autoSpaceDE w:val="0"/>
               <w:widowControl/>
               <w:spacing w:line="262" w:lineRule="auto" w:before="106" w:after="0"/>
-              <w:ind w:left="144" w:right="288" w:firstLine="0"/>
+              <w:ind w:left="144" w:right="144" w:firstLine="0"/>
               <w:jc w:val="left"/>
             </w:pPr>
             <w:r>
@@ -10810,7 +10807,7 @@
                 <w:color w:val="1F1E1D"/>
                 <w:sz w:val="23"/>
               </w:rPr>
-              <w:t xml:space="preserve">Cost breakdown by group · unit cost </w:t>
+              <w:t xml:space="preserve">Optimum B-series propeller · engine </w:t>
             </w:r>
             <w:r>
               <w:br/>
@@ -10824,7 +10821,7 @@
                 <w:color w:val="1F1E1D"/>
                 <w:sz w:val="23"/>
               </w:rPr>
-              <w:t>sources · link to the general arrangement</w:t>
+              <w:t>matching · PTO/PTI modes · stern drawing</w:t>
             </w:r>
           </w:p>
         </w:tc>
@@ -10899,7 +10896,7 @@
                 <w:color w:val="1F1E1D"/>
                 <w:sz w:val="23"/>
               </w:rPr>
-              <w:t>Parametric Hull Shape Generation</w:t>
+              <w:t>Electrical Load Balance</w:t>
             </w:r>
           </w:p>
         </w:tc>
@@ -10923,7 +10920,7 @@
               <w:autoSpaceDE w:val="0"/>
               <w:widowControl/>
               <w:spacing w:line="262" w:lineRule="auto" w:before="106" w:after="0"/>
-              <w:ind w:left="144" w:right="144" w:firstLine="0"/>
+              <w:ind w:left="144" w:right="1008" w:firstLine="0"/>
               <w:jc w:val="left"/>
             </w:pPr>
             <w:r>
@@ -10935,18 +10932,18 @@
                 <w:color w:val="1F1E1D"/>
                 <w:sz w:val="23"/>
               </w:rPr>
-              <w:t xml:space="preserve">Parametric hull definition · coupling to the </w:t>
-            </w:r>
-            <w:r>
-              <w:rPr>
-                <w:w w:val="98.08695419974948"/>
-                <w:rFonts w:ascii="Anthropic Sans Print" w:hAnsi="Anthropic Sans Print" w:eastAsia="Anthropic Sans Print"/>
-                <w:b w:val="0"/>
-                <w:i w:val="0"/>
-                <w:color w:val="1F1E1D"/>
-                <w:sz w:val="23"/>
-              </w:rPr>
-              <w:t>optimizer · lines plan</w:t>
+              <w:t>Consumers per operating mode ·</w:t>
+            </w:r>
+            <w:r>
+              <w:rPr>
+                <w:w w:val="98.08695419974948"/>
+                <w:rFonts w:ascii="Anthropic Sans Print" w:hAnsi="Anthropic Sans Print" w:eastAsia="Anthropic Sans Print"/>
+                <w:b w:val="0"/>
+                <w:i w:val="0"/>
+                <w:color w:val="1F1E1D"/>
+                <w:sz w:val="23"/>
+              </w:rPr>
+              <w:t>generator sizing · one-line diagram</w:t>
             </w:r>
           </w:p>
         </w:tc>
@@ -11008,8 +11005,8 @@
               <w:autoSpaceDN w:val="0"/>
               <w:autoSpaceDE w:val="0"/>
               <w:widowControl/>
-              <w:spacing w:line="262" w:lineRule="auto" w:before="108" w:after="0"/>
-              <w:ind w:left="154" w:right="720" w:firstLine="0"/>
+              <w:spacing w:line="240" w:lineRule="auto" w:before="108" w:after="0"/>
+              <w:ind w:left="154" w:right="0" w:firstLine="0"/>
               <w:jc w:val="left"/>
             </w:pPr>
             <w:r>
@@ -11021,18 +11018,7 @@
                 <w:color w:val="1F1E1D"/>
                 <w:sz w:val="23"/>
               </w:rPr>
-              <w:t xml:space="preserve">Engine Room and Steering Room </w:t>
-            </w:r>
-            <w:r>
-              <w:rPr>
-                <w:w w:val="98.08695419974948"/>
-                <w:rFonts w:ascii="Anthropic Sans Print" w:hAnsi="Anthropic Sans Print" w:eastAsia="Anthropic Sans Print"/>
-                <w:b w:val="0"/>
-                <w:i w:val="0"/>
-                <w:color w:val="1F1E1D"/>
-                <w:sz w:val="23"/>
-              </w:rPr>
-              <w:t>Arrangement</w:t>
+              <w:t>Alternative Fuel and Energy Storage</w:t>
             </w:r>
           </w:p>
         </w:tc>
@@ -11056,7 +11042,7 @@
               <w:autoSpaceDE w:val="0"/>
               <w:widowControl/>
               <w:spacing w:line="262" w:lineRule="auto" w:before="108" w:after="0"/>
-              <w:ind w:left="144" w:right="432" w:firstLine="0"/>
+              <w:ind w:left="144" w:right="144" w:firstLine="0"/>
               <w:jc w:val="left"/>
             </w:pPr>
             <w:r>
@@ -11068,18 +11054,18 @@
                 <w:color w:val="1F1E1D"/>
                 <w:sz w:val="23"/>
               </w:rPr>
-              <w:t xml:space="preserve">Machinery layout · rudder and steering </w:t>
-            </w:r>
-            <w:r>
-              <w:rPr>
-                <w:w w:val="98.08695419974948"/>
-                <w:rFonts w:ascii="Anthropic Sans Print" w:hAnsi="Anthropic Sans Print" w:eastAsia="Anthropic Sans Print"/>
-                <w:b w:val="0"/>
-                <w:i w:val="0"/>
-                <w:color w:val="1F1E1D"/>
-                <w:sz w:val="23"/>
-              </w:rPr>
-              <w:t>gear · arrangement drawing</w:t>
+              <w:t>Energy per voyage · tank or battery sizing ·</w:t>
+            </w:r>
+            <w:r>
+              <w:rPr>
+                <w:w w:val="98.08695419974948"/>
+                <w:rFonts w:ascii="Anthropic Sans Print" w:hAnsi="Anthropic Sans Print" w:eastAsia="Anthropic Sans Print"/>
+                <w:b w:val="0"/>
+                <w:i w:val="0"/>
+                <w:color w:val="1F1E1D"/>
+                <w:sz w:val="23"/>
+              </w:rPr>
+              <w:t>rules check</w:t>
             </w:r>
           </w:p>
         </w:tc>
@@ -11154,7 +11140,7 @@
                 <w:color w:val="1F1E1D"/>
                 <w:sz w:val="23"/>
               </w:rPr>
-              <w:t>Preliminary Stability Calculation</w:t>
+              <w:t>Detailed Emissions Calculation</w:t>
             </w:r>
           </w:p>
         </w:tc>
@@ -11190,18 +11176,18 @@
                 <w:color w:val="1F1E1D"/>
                 <w:sz w:val="23"/>
               </w:rPr>
-              <w:t xml:space="preserve">Loading conditions · GZ curves against </w:t>
-            </w:r>
-            <w:r>
-              <w:rPr>
-                <w:w w:val="98.08695419974948"/>
-                <w:rFonts w:ascii="Anthropic Sans Print" w:hAnsi="Anthropic Sans Print" w:eastAsia="Anthropic Sans Print"/>
-                <w:b w:val="0"/>
-                <w:i w:val="0"/>
-                <w:color w:val="1F1E1D"/>
-                <w:sz w:val="23"/>
-              </w:rPr>
-              <w:t>criteria · tank and capacity plan</w:t>
+              <w:t xml:space="preserve">Fuel use per mode · CO2, SOx, NOx per </w:t>
+            </w:r>
+            <w:r>
+              <w:rPr>
+                <w:w w:val="98.08695419974948"/>
+                <w:rFonts w:ascii="Anthropic Sans Print" w:hAnsi="Anthropic Sans Print" w:eastAsia="Anthropic Sans Print"/>
+                <w:b w:val="0"/>
+                <w:i w:val="0"/>
+                <w:color w:val="1F1E1D"/>
+                <w:sz w:val="23"/>
+              </w:rPr>
+              <w:t>year · machinery arrangement</w:t>
             </w:r>
           </w:p>
         </w:tc>
@@ -11263,8 +11249,8 @@
               <w:autoSpaceDN w:val="0"/>
               <w:autoSpaceDE w:val="0"/>
               <w:widowControl/>
-              <w:spacing w:line="240" w:lineRule="auto" w:before="106" w:after="0"/>
-              <w:ind w:left="154" w:right="0" w:firstLine="0"/>
+              <w:spacing w:line="262" w:lineRule="auto" w:before="106" w:after="0"/>
+              <w:ind w:left="154" w:right="720" w:firstLine="0"/>
               <w:jc w:val="left"/>
             </w:pPr>
             <w:r>
@@ -11276,7 +11262,18 @@
                 <w:color w:val="1F1E1D"/>
                 <w:sz w:val="23"/>
               </w:rPr>
-              <w:t>Hull Shape Optimization</w:t>
+              <w:t xml:space="preserve">Engine Room and Steering Room </w:t>
+            </w:r>
+            <w:r>
+              <w:rPr>
+                <w:w w:val="98.08695419974948"/>
+                <w:rFonts w:ascii="Anthropic Sans Print" w:hAnsi="Anthropic Sans Print" w:eastAsia="Anthropic Sans Print"/>
+                <w:b w:val="0"/>
+                <w:i w:val="0"/>
+                <w:color w:val="1F1E1D"/>
+                <w:sz w:val="23"/>
+              </w:rPr>
+              <w:t>Arrangement</w:t>
             </w:r>
           </w:p>
         </w:tc>
@@ -11312,18 +11309,18 @@
                 <w:color w:val="1F1E1D"/>
                 <w:sz w:val="23"/>
               </w:rPr>
-              <w:t xml:space="preserve">Hull variables and objective · resistance </w:t>
-            </w:r>
-            <w:r>
-              <w:rPr>
-                <w:w w:val="98.08695419974948"/>
-                <w:rFonts w:ascii="Anthropic Sans Print" w:hAnsi="Anthropic Sans Print" w:eastAsia="Anthropic Sans Print"/>
-                <w:b w:val="0"/>
-                <w:i w:val="0"/>
-                <w:color w:val="1F1E1D"/>
-                <w:sz w:val="23"/>
-              </w:rPr>
-              <w:t>gain · initial and optimized lines</w:t>
+              <w:t xml:space="preserve">Machinery layout · rudder and steering </w:t>
+            </w:r>
+            <w:r>
+              <w:rPr>
+                <w:w w:val="98.08695419974948"/>
+                <w:rFonts w:ascii="Anthropic Sans Print" w:hAnsi="Anthropic Sans Print" w:eastAsia="Anthropic Sans Print"/>
+                <w:b w:val="0"/>
+                <w:i w:val="0"/>
+                <w:color w:val="1F1E1D"/>
+                <w:sz w:val="23"/>
+              </w:rPr>
+              <w:t>gear · arrangement drawing</w:t>
             </w:r>
           </w:p>
         </w:tc>
@@ -11398,7 +11395,7 @@
                 <w:color w:val="1F1E1D"/>
                 <w:sz w:val="23"/>
               </w:rPr>
-              <w:t>Damage Probabilistic Calculations</w:t>
+              <w:t>Longitudinal Strength Calculation</w:t>
             </w:r>
           </w:p>
         </w:tc>
@@ -11422,7 +11419,7 @@
               <w:autoSpaceDE w:val="0"/>
               <w:widowControl/>
               <w:spacing w:line="262" w:lineRule="auto" w:before="106" w:after="0"/>
-              <w:ind w:left="144" w:right="144" w:firstLine="0"/>
+              <w:ind w:left="144" w:right="288" w:firstLine="0"/>
               <w:jc w:val="left"/>
             </w:pPr>
             <w:r>
@@ -11434,18 +11431,18 @@
                 <w:color w:val="1F1E1D"/>
                 <w:sz w:val="23"/>
               </w:rPr>
-              <w:t>Baseline A only · watertight subdivision · A</w:t>
-            </w:r>
-            <w:r>
-              <w:rPr>
-                <w:w w:val="98.08695419974948"/>
-                <w:rFonts w:ascii="Anthropic Sans Print" w:hAnsi="Anthropic Sans Print" w:eastAsia="Anthropic Sans Print"/>
-                <w:b w:val="0"/>
-                <w:i w:val="0"/>
-                <w:color w:val="1F1E1D"/>
-                <w:sz w:val="23"/>
-              </w:rPr>
-              <w:t>≥ R · subdivision plan</w:t>
+              <w:t xml:space="preserve">Loads and bending moments · section </w:t>
+            </w:r>
+            <w:r>
+              <w:rPr>
+                <w:w w:val="98.08695419974948"/>
+                <w:rFonts w:ascii="Anthropic Sans Print" w:hAnsi="Anthropic Sans Print" w:eastAsia="Anthropic Sans Print"/>
+                <w:b w:val="0"/>
+                <w:i w:val="0"/>
+                <w:color w:val="1F1E1D"/>
+                <w:sz w:val="23"/>
+              </w:rPr>
+              <w:t>modulus check · midship section drawing</w:t>
             </w:r>
           </w:p>
         </w:tc>
@@ -11520,7 +11517,7 @@
                 <w:color w:val="1F1E1D"/>
                 <w:sz w:val="23"/>
               </w:rPr>
-              <w:t>Detailed Emissions Calculation</w:t>
+              <w:t>Preliminary Stability Calculation</w:t>
             </w:r>
           </w:p>
         </w:tc>
@@ -11556,18 +11553,18 @@
                 <w:color w:val="1F1E1D"/>
                 <w:sz w:val="23"/>
               </w:rPr>
-              <w:t xml:space="preserve">Fuel use per mode · CO2, SOx, NOx per </w:t>
-            </w:r>
-            <w:r>
-              <w:rPr>
-                <w:w w:val="98.08695419974948"/>
-                <w:rFonts w:ascii="Anthropic Sans Print" w:hAnsi="Anthropic Sans Print" w:eastAsia="Anthropic Sans Print"/>
-                <w:b w:val="0"/>
-                <w:i w:val="0"/>
-                <w:color w:val="1F1E1D"/>
-                <w:sz w:val="23"/>
-              </w:rPr>
-              <w:t>year · machinery arrangement</w:t>
+              <w:t xml:space="preserve">Loading conditions · GZ curves against </w:t>
+            </w:r>
+            <w:r>
+              <w:rPr>
+                <w:w w:val="98.08695419974948"/>
+                <w:rFonts w:ascii="Anthropic Sans Print" w:hAnsi="Anthropic Sans Print" w:eastAsia="Anthropic Sans Print"/>
+                <w:b w:val="0"/>
+                <w:i w:val="0"/>
+                <w:color w:val="1F1E1D"/>
+                <w:sz w:val="23"/>
+              </w:rPr>
+              <w:t>criteria · tank and capacity plan</w:t>
             </w:r>
           </w:p>
         </w:tc>
@@ -11642,7 +11639,7 @@
                 <w:color w:val="1F1E1D"/>
                 <w:sz w:val="23"/>
               </w:rPr>
-              <w:t>Advanced Dimensional Analysis</w:t>
+              <w:t>Damage Probabilistic Calculations</w:t>
             </w:r>
           </w:p>
         </w:tc>
@@ -11678,18 +11675,18 @@
                 <w:color w:val="1F1E1D"/>
                 <w:sz w:val="23"/>
               </w:rPr>
-              <w:t xml:space="preserve">Regression equations for dimensions and </w:t>
-            </w:r>
-            <w:r>
-              <w:rPr>
-                <w:w w:val="98.08695419974948"/>
-                <w:rFonts w:ascii="Anthropic Sans Print" w:hAnsi="Anthropic Sans Print" w:eastAsia="Anthropic Sans Print"/>
-                <w:b w:val="0"/>
-                <w:i w:val="0"/>
-                <w:color w:val="1F1E1D"/>
-                <w:sz w:val="23"/>
-              </w:rPr>
-              <w:t>ratios · fit quality and validity range</w:t>
+              <w:t>Baseline A only · watertight subdivision · A</w:t>
+            </w:r>
+            <w:r>
+              <w:rPr>
+                <w:w w:val="98.08695419974948"/>
+                <w:rFonts w:ascii="Anthropic Sans Print" w:hAnsi="Anthropic Sans Print" w:eastAsia="Anthropic Sans Print"/>
+                <w:b w:val="0"/>
+                <w:i w:val="0"/>
+                <w:color w:val="1F1E1D"/>
+                <w:sz w:val="23"/>
+              </w:rPr>
+              <w:t>≥ R · subdivision plan</w:t>
             </w:r>
           </w:p>
         </w:tc>
@@ -11764,7 +11761,7 @@
                 <w:color w:val="1F1E1D"/>
                 <w:sz w:val="23"/>
               </w:rPr>
-              <w:t>Alternative Fuel and Energy Storage</w:t>
+              <w:t>Detailed Cost Estimation</w:t>
             </w:r>
           </w:p>
         </w:tc>
@@ -11788,7 +11785,7 @@
               <w:autoSpaceDE w:val="0"/>
               <w:widowControl/>
               <w:spacing w:line="262" w:lineRule="auto" w:before="108" w:after="0"/>
-              <w:ind w:left="144" w:right="144" w:firstLine="0"/>
+              <w:ind w:left="144" w:right="288" w:firstLine="0"/>
               <w:jc w:val="left"/>
             </w:pPr>
             <w:r>
@@ -11800,18 +11797,21 @@
                 <w:color w:val="1F1E1D"/>
                 <w:sz w:val="23"/>
               </w:rPr>
-              <w:t>Energy per voyage · tank or battery sizing ·</w:t>
-            </w:r>
-            <w:r>
-              <w:rPr>
-                <w:w w:val="98.08695419974948"/>
-                <w:rFonts w:ascii="Anthropic Sans Print" w:hAnsi="Anthropic Sans Print" w:eastAsia="Anthropic Sans Print"/>
-                <w:b w:val="0"/>
-                <w:i w:val="0"/>
-                <w:color w:val="1F1E1D"/>
-                <w:sz w:val="23"/>
-              </w:rPr>
-              <w:t>rules check</w:t>
+              <w:t xml:space="preserve">Cost breakdown by group · unit cost </w:t>
+            </w:r>
+            <w:r>
+              <w:br/>
+            </w:r>
+            <w:r>
+              <w:rPr>
+                <w:w w:val="98.08695419974948"/>
+                <w:rFonts w:ascii="Anthropic Sans Print" w:hAnsi="Anthropic Sans Print" w:eastAsia="Anthropic Sans Print"/>
+                <w:b w:val="0"/>
+                <w:i w:val="0"/>
+                <w:color w:val="1F1E1D"/>
+                <w:sz w:val="23"/>
+              </w:rPr>
+              <w:t>sources · link to the general arrangement</w:t>
             </w:r>
           </w:p>
         </w:tc>

</xml_diff>